<commit_message>
Regenerate strategy-request.docx from anonymized markdown source
https://claude.ai/code/session_01TrDiVJT3V3rEKQD61jxEp5
</commit_message>
<xml_diff>
--- a/wealth-management/output/strategy-request.docx
+++ b/wealth-management/output/strategy-request.docx
@@ -16,7 +16,7 @@
           <w:color w:val="666666"/>
           <w:sz w:val="18"/>
         </w:rPr>
-        <w:t>Date: 01 March 2026</w:t>
+        <w:t>Date: 04 March 2026</w:t>
       </w:r>
     </w:p>
     <w:p/>
@@ -1894,7 +1894,7 @@
                 <w:rFonts w:ascii="Calibri" w:hAnsi="Calibri"/>
                 <w:sz w:val="18"/>
               </w:rPr>
-              <w:t>To be confirmed. CA-C (60/40) selected based on 3 to 5 year pre-retirement horizon</w:t>
+              <w:t>Confirmed. Profile C (Balanced). CA-C (60/40) selected based on 3 to 5 year pre-retirement horizon</w:t>
             </w:r>
           </w:p>
         </w:tc>
@@ -3259,7 +3259,7 @@
     <w:p>
       <w:pPr/>
       <w:r>
-        <w:t>Downsizer contribution note: if the client sells or downsizes the $2,200,000 property at or after 55, she can contribute up to $300,000 into super as a downsizer contribution. Not counted against CC or NCC caps. Counted for Age Pension assets test from day one. Not modelled as a current recommendation but noted as a future option.</w:t>
+        <w:t>Downsizer contribution note: if the client sells or downsizes the $2,200,000 property at or after 55, the client can contribute up to $300,000 into super as a downsizer contribution. Not counted against CC or NCC caps. Counted for Age Pension assets test from day one. Not modelled as a current recommendation but noted as a future option.</w:t>
       </w:r>
     </w:p>
     <w:p>
@@ -3442,7 +3442,7 @@
                 <w:rFonts w:ascii="Calibri" w:hAnsi="Calibri"/>
                 <w:sz w:val="18"/>
               </w:rPr>
-              <w:t>Risk profile: to be confirmed. CA-C (60/40) selected based on 3 to 5 year pre-retirement horizon and existing defensive buffer outside super. Confirm risk profiling tool has been completed. If mismatch, document rationale per CONVENTIONS.md</w:t>
+              <w:t>Risk profile: Confirmed as Profile C (Balanced). CA-C (60/40) selected based on 3 to 5 year pre-retirement horizon and existing defensive buffer outside super. Risk profiling tool completed. No mismatch</w:t>
             </w:r>
           </w:p>
         </w:tc>
@@ -4255,6 +4255,62 @@
           </w:p>
         </w:tc>
       </w:tr>
+      <w:tr>
+        <w:tc>
+          <w:tcPr>
+            <w:tcW w:type="dxa" w:w="3324"/>
+          </w:tcPr>
+          <w:p>
+            <w:pPr>
+              <w:jc w:val="left"/>
+            </w:pPr>
+            <w:r/>
+            <w:r>
+              <w:rPr>
+                <w:rFonts w:ascii="Calibri" w:hAnsi="Calibri"/>
+                <w:sz w:val="18"/>
+              </w:rPr>
+              <w:t>v2</w:t>
+            </w:r>
+          </w:p>
+        </w:tc>
+        <w:tc>
+          <w:tcPr>
+            <w:tcW w:type="dxa" w:w="3324"/>
+          </w:tcPr>
+          <w:p>
+            <w:pPr>
+              <w:jc w:val="left"/>
+            </w:pPr>
+            <w:r/>
+            <w:r>
+              <w:rPr>
+                <w:rFonts w:ascii="Calibri" w:hAnsi="Calibri"/>
+                <w:sz w:val="18"/>
+              </w:rPr>
+              <w:t>2026-03-01</w:t>
+            </w:r>
+          </w:p>
+        </w:tc>
+        <w:tc>
+          <w:tcPr>
+            <w:tcW w:type="dxa" w:w="3324"/>
+          </w:tcPr>
+          <w:p>
+            <w:pPr>
+              <w:jc w:val="left"/>
+            </w:pPr>
+            <w:r/>
+            <w:r>
+              <w:rPr>
+                <w:rFonts w:ascii="Calibri" w:hAnsi="Calibri"/>
+                <w:sz w:val="18"/>
+              </w:rPr>
+              <w:t>Risk profile confirmed as Profile C (Balanced). Updated risk score status from "To be confirmed" to confirmed across projection parameters and notes to AA</w:t>
+            </w:r>
+          </w:p>
+        </w:tc>
+      </w:tr>
     </w:tbl>
     <w:p/>
     <w:sectPr>

</xml_diff>